<commit_message>
Update final project AI acknowledgments
</commit_message>
<xml_diff>
--- a/algorithms/Algorithms Narrative.docx
+++ b/algorithms/Algorithms Narrative.docx
@@ -151,13 +151,7 @@
     </w:p>
     <w:p>
       <w:r>
-        <w:t>AI use acknowledgment: OpenAI Codex assisted with drafting, code changes</w:t>
-      </w:r>
-      <w:r>
-        <w:t>, source verification, and document preparation</w:t>
-      </w:r>
-      <w:r>
-        <w:t>.</w:t>
+        <w:t>AI use acknowledgment: Open AI Codex helped me understand the problem, research, and some agentic coding. The final project was still driven by me.</w:t>
       </w:r>
     </w:p>
     <w:p>

</xml_diff>